<commit_message>
Make solution, technology and market slides easier to read
Slide 6 shows the priority report as numbered risk markers on a
platform photo; slide 7 replaces the scatter plot with surface photo,
rust color and corrosion-rate bars per risk level; slide 9 swaps the
TAM/SAM/SOM placeholders for the Gulf of Mexico platform count (BSEE),
buying motives and entry order. Slide 3 notes that AMPP still cites
the IMPACT figure in 2025. Notes and the Word script follow.

Co-Authored-By: Claude Opus 5.5 <noreply@anthropic.com>
Claude-Session: https://claude.ai/code/session_01WJhUeJknrpz3z9hRfyX3tP
</commit_message>
<xml_diff>
--- a/MLC_IR_A-STREAM2026_script.docx
+++ b/MLC_IR_A-STREAM2026_script.docx
@@ -41,7 +41,7 @@
           <w:sz w:val="20"/>
           <w:szCs w:val="20"/>
         </w:rPr>
-        <w:t xml:space="preserve">2026. 10. 21 · 발표 시간 5분 · 슬라이드 11장 · 대본 합계 약 4분 45초</w:t>
+        <w:t xml:space="preserve">2026. 10. 21 · 발표 시간 5분 · 슬라이드 11장 · 대본 합계 약 4분 58초</w:t>
       </w:r>
     </w:p>
     <w:tbl>
@@ -304,7 +304,7 @@
                 <w:sz w:val="22"/>
                 <w:szCs w:val="22"/>
               </w:rPr>
-              <w:t xml:space="preserve">부식은 생각보다 큰 문제입니다. 전 세계가 매년 부식으로 잃는 비용은 약 2.5조 달러, 세계 GDP의 3.4%입니다. 환경 비용도 큽니다. 매년 생산되는 철강의 4분의 1에서 3분의 1이 부식으로 잃은 강재를 메우는 데 쓰이고, 이 강재를 다시 만드는 과정에서 전 세계 이산화탄소 배출의 1.6~3.4%가 나옵니다. 반대로 부식을 제때 찾아 관리하면 이 비용의 15~35%를 줄일 수 있습니다. 문제는 '제때 찾는 것'이 어렵다는 점입니다.</w:t>
+              <w:t xml:space="preserve">부식은 생각보다 큰 문제입니다. 전 세계가 매년 부식으로 잃는 비용은 약 2.5조 달러, 세계 GDP의 3.4%입니다. 국제 부식 학회인 AMPP가 2025년에도 공식적으로 인용하는 수치입니다. 환경 비용도 큽니다. 매년 생산되는 철강의 4분의 1에서 3분의 1이 부식으로 잃은 강재를 메우는 데 쓰이고, 이 강재를 다시 만드는 과정에서 전 세계 이산화탄소 배출의 1.6~3.4%가 나옵니다. 반대로 부식을 제때 찾아 관리하면 이 비용의 15~35%, 연간 3,750억에서 8,750억 달러를 줄일 수 있습니다. 문제는 '제때 찾는 것'이 어렵다는 점입니다.</w:t>
             </w:r>
           </w:p>
         </w:tc>
@@ -363,7 +363,7 @@
                 <w:sz w:val="18"/>
                 <w:szCs w:val="18"/>
               </w:rPr>
-              <w:t xml:space="preserve">약 30초</w:t>
+              <w:t xml:space="preserve">약 28초</w:t>
             </w:r>
           </w:p>
         </w:tc>
@@ -387,7 +387,7 @@
                 <w:sz w:val="22"/>
                 <w:szCs w:val="22"/>
               </w:rPr>
-              <w:t xml:space="preserve">특히 해양 구조물이 그렇습니다. 파도가 치는 비말대는 부식이 가장 빠른 곳인데, 로프 액세스나 잠수, ROV 없이는 볼 수가 없습니다. 미국 현장에서 들은 이야기는 일관됐습니다. 지금은 상태와 상관없이 모든 지점을 똑같이 돌고, 비용의 대부분은 검사 자체가 아니라 배를 빌리고 날씨를 기다리고 리프트를 빌리는 데서 나옵니다. 점검 주기는 규제로 정해져 있어 줄일 수 없습니다. 결국 문제는 그 주기 안에서 어디에 사람과 배를 먼저 보낼지입니다.</w:t>
+              <w:t xml:space="preserve">특히 해양 구조물이 그렇습니다. 파도가 치는 비말대는 부식이 가장 빠른 곳인데, 로프 액세스나 잠수, ROV 없이는 볼 수가 없습니다. 지금은 상태와 상관없이 모든 지점을 똑같이 돌고, 비용의 대부분은 검사 자체가 아니라 배를 빌리고 날씨를 기다리고 리프트를 빌리는 데서 나옵니다. 점검 주기는 규제로 정해져 있어 줄일 수 없습니다. 결국 문제는 그 주기 안에서 어디에 사람과 배를 먼저 보낼지입니다.</w:t>
             </w:r>
           </w:p>
         </w:tc>
@@ -529,7 +529,7 @@
                 <w:sz w:val="18"/>
                 <w:szCs w:val="18"/>
               </w:rPr>
-              <w:t xml:space="preserve">약 30초</w:t>
+              <w:t xml:space="preserve">약 35초</w:t>
             </w:r>
           </w:p>
         </w:tc>
@@ -553,7 +553,7 @@
                 <w:sz w:val="22"/>
                 <w:szCs w:val="22"/>
               </w:rPr>
-              <w:t xml:space="preserve">그래서 MLC는 이렇게 작동합니다. 드론이나 카메라로 접근이 어려운 구간을 먼저 찍습니다. 녹이 있는 부분만 자동으로 골라내고, 그 녹의 색으로 부식 속도 구간을 판정해 위험도를 높음, 중간, 낮음으로 매깁니다. 마지막으로 어느 지점부터 가까이 봐야 하는지 순서를 정한 리포트를 드립니다. 규제 주기는 그대로 지키면서, 사람과 배와 리프트를 위험한 곳에 먼저 보내는 겁니다.</w:t>
+              <w:t xml:space="preserve">그래서 MLC는 이렇게 작동합니다. 드론이나 카메라로 접근이 어려운 구간을 먼저 찍습니다. 녹이 있는 부분만 자동으로 골라내고, 그 녹의 색으로 부식 속도 구간을 판정해 위험도를 높음, 중간, 낮음으로 매깁니다. 마지막으로 구조물 사진 위에 위험한 지점부터 번호를 매긴 지도를 드립니다. 빨간 1번은 바로 점검하고, 파란 3번은 다음 주기로 미뤄도 되는 곳입니다. 규제 주기는 그대로 지키면서, 사람과 배와 리프트를 위험한 곳에 먼저 보내는 겁니다.</w:t>
             </w:r>
           </w:p>
         </w:tc>
@@ -612,7 +612,7 @@
                 <w:sz w:val="18"/>
                 <w:szCs w:val="18"/>
               </w:rPr>
-              <w:t xml:space="preserve">약 30초</w:t>
+              <w:t xml:space="preserve">약 35초</w:t>
             </w:r>
           </w:p>
         </w:tc>
@@ -636,7 +636,7 @@
                 <w:sz w:val="22"/>
                 <w:szCs w:val="22"/>
               </w:rPr>
-              <w:t xml:space="preserve">핵심 기술은 실험실에서 검증했습니다. 탄소강을 240시간 촉진부식 시키며 아홉 시점에서 측정했더니, 녹의 색 좌표 b* 값이 커질수록 실제 부식 속도도 빨라졌고, 순위 상관계수는 0.88이었습니다. 위험도 세 구간은 서로 겹치지 않게 나뉩니다. 이 색 변화는 부식을 빠르게 만드는 다공성 녹 성분이 늘어나면서 생기기 때문에, 색과 속도가 함께 움직이는 물리적 근거도 있습니다. 이 결과는 SEM, XRD, 전기화학 등 여섯 가지 분석으로 교차 검증했습니다.</w:t>
+              <w:t xml:space="preserve">핵심 기술은 실험실에서 검증했습니다. 탄소강을 240시간 촉진부식 시키며 측정했습니다. 보시는 것처럼 표면의 녹 색이 변하면서 색 좌표 b* 값이 1.7에서 13.1로 커지고, 같은 기간 실제 부식 속도는 연 0.34mm에서 1.45mm로 약 4배 빨라졌습니다. 색과 부식 속도의 순위 상관계수는 0.88이고, 위험도 세 구간의 부식 속도는 서로 겹치지 않습니다. 이 색 변화는 부식을 빠르게 만드는 다공성 녹 성분이 늘어나면서 생기기 때문에, 색과 속도가 함께 움직이는 물리적 근거도 있습니다. 이 결과는 SEM, XRD, 전기화학 등 여섯 가지 분석으로 교차 검증했습니다.</w:t>
             </w:r>
           </w:p>
         </w:tc>
@@ -778,7 +778,7 @@
                 <w:sz w:val="18"/>
                 <w:szCs w:val="18"/>
               </w:rPr>
-              <w:t xml:space="preserve">약 25초</w:t>
+              <w:t xml:space="preserve">약 30초</w:t>
             </w:r>
           </w:p>
         </w:tc>
@@ -802,7 +802,7 @@
                 <w:sz w:val="22"/>
                 <w:szCs w:val="22"/>
               </w:rPr>
-              <w:t xml:space="preserve">이 시장의 특징은 규제가 반복 수요를 만든다는 점입니다. 미국 해양 플랫폼은 매년 수상 육안 점검, 3~5년마다 수중 점검, 6~10년마다 정밀 점검을 해야 하고, 네 개 기관이 이를 겹쳐서 규제합니다. 미국에서 먼저 검증한 뒤 국내 해상풍력과 해양 플랜트로 넓힐 계획입니다.</w:t>
+              <w:t xml:space="preserve">이 시장은 규제가 반복 수요를 만듭니다. 미국 해양 플랫폼은 매년, 3~5년, 6~10년 주기로 점검이 의무입니다. 첫 타깃은 멕시코만의 유인 생산 플랫폼 371곳으로, 모두 매년 점검이 돌아오는 고객입니다. 인터뷰에서 확인한 구매 동기는 안전, 비용, 규제와 보험 대응 세 가지였습니다. 멕시코만 플랫폼에서 시작해 미드스트림 가스 압축 기지, 그리고 국내 해상풍력과 해양 플랜트로 넓혀 가겠습니다.</w:t>
             </w:r>
           </w:p>
         </w:tc>

</xml_diff>